<commit_message>
第 1 節第 10 張：介紹 onsemi 與 AR0233AT
兩顆光達都有好好介紹（旋轉式／固定式、誰在用），相機那一顆只有一句
「就是相機裡面那塊晶片」就帶過去了。補三句：

  onsemi 是美國半導體公司，前身 ON Semiconductor，2021 年改成全小寫。
  影像感測器來自 2014 年併購的 Aptina——所以型號是 AR 開頭，那是 Aptina
  留下來的產品線代號。車用這一塊最常碰到 onsemi、Sony、OmniVision 三家。

  型號結尾的 AT：onsemi 的車規型號習慣用 AT 結尾（AR0233AT、AR0234AT），
  同一顆的非車規版本換別的後綴（AR0234CS）。

  最重要的一句：onsemi 賣的是「晶片」，不是「相機」——鏡頭要自己配。

第三句是刻意放在這裡的：它就是這一張「為什麼找不到視野」的答案，先讓學生
記著，找不到的時候才會自己想通，而不是等第 11 張揭曉。

講義 3.1 也加同一個方塊，放在「相機的規格表上沒有視野」那一節開頭。
併購年份與改名年份查過（2014 年 8 月完成併購、2021 年 8 月改名）；市佔數字
沒有引用，因為查到的是 2014 年全影像感測器市場的數字，不是車用這一塊。

Co-Authored-By: Claude Opus 5 (1M context) <noreply@anthropic.com>
</commit_message>
<xml_diff>
--- a/第五週(10-08)/Nguyên lý xe tự lái_Tuần 5_Tài liệu học tập.docx
+++ b/第五週(10-08)/Nguyên lý xe tự lái_Tuần 5_Tài liệu học tập.docx
@@ -4027,6 +4027,97 @@
         <w:t xml:space="preserve">Bảng thông số camera không có dòng «góc nhìn»</w:t>
       </w:r>
     </w:p>
+    <w:tbl>
+      <w:tblPr>
+        <w:tblW w:type="dxa" w:w="9360"/>
+        <w:tblBorders>
+          <w:top w:val="single" w:color="A8B2BA" w:sz="6"/>
+          <w:left w:val="none"/>
+          <w:bottom w:val="single" w:color="A8B2BA" w:sz="6"/>
+          <w:right w:val="none"/>
+          <w:insideH w:val="none"/>
+          <w:insideV w:val="none"/>
+        </w:tblBorders>
+      </w:tblPr>
+      <w:tblGrid>
+        <w:gridCol w:w="9360"/>
+      </w:tblGrid>
+      <w:tr>
+        <w:trPr>
+          <w:cantSplit/>
+        </w:trPr>
+        <w:tc>
+          <w:tcPr>
+            <w:tcW w:type="dxa" w:w="9360"/>
+            <w:shd w:fill="F6F8F9" w:color="auto" w:val="clear"/>
+            <w:tcMar>
+              <w:top w:type="dxa" w:w="140"/>
+              <w:left w:type="dxa" w:w="200"/>
+              <w:bottom w:type="dxa" w:w="140"/>
+              <w:right w:type="dxa" w:w="180"/>
+            </w:tcMar>
+          </w:tcPr>
+          <w:p>
+            <w:pPr>
+              <w:spacing w:after="90" w:line="300"/>
+            </w:pPr>
+            <w:r>
+              <w:rPr>
+                <w:rFonts w:ascii="Arial" w:cs="Arial" w:eastAsia="Arial" w:hAnsi="Arial"/>
+                <w:b/>
+                <w:bCs/>
+                <w:color w:val="24405C"/>
+                <w:sz w:val="20"/>
+                <w:szCs w:val="20"/>
+              </w:rPr>
+              <w:t xml:space="preserve">onsemi và AR0233AT là gì</w:t>
+            </w:r>
+          </w:p>
+          <w:p>
+            <w:pPr>
+              <w:spacing w:after="80" w:line="310"/>
+            </w:pPr>
+            <w:r>
+              <w:rPr>
+                <w:rFonts w:ascii="Arial" w:cs="Arial" w:eastAsia="Arial" w:hAnsi="Arial"/>
+                <w:color w:val="1B1B1B"/>
+                <w:sz w:val="20"/>
+                <w:szCs w:val="20"/>
+              </w:rPr>
+              <w:t xml:space="preserve">onsemi là công ty bán dẫn Mỹ, trước đây tên ON Semiconductor, năm 2021 đổi sang cách viết thường như hiện nay. Mảng cảm biến ảnh của họ đến từ việc mua lại Aptina năm 2014 — vì vậy mã sản phẩm mới bắt đầu bằng AR, đó là mã dòng sản phẩm Aptina để lại. Trong mảng cảm biến ảnh ô tô, ba hãng hay gặp nhất là onsemi, Sony và OmniVision.</w:t>
+            </w:r>
+          </w:p>
+          <w:p>
+            <w:pPr>
+              <w:spacing w:after="80" w:line="310"/>
+            </w:pPr>
+            <w:r>
+              <w:rPr>
+                <w:rFonts w:ascii="Arial" w:cs="Arial" w:eastAsia="Arial" w:hAnsi="Arial"/>
+                <w:color w:val="1B1B1B"/>
+                <w:sz w:val="20"/>
+                <w:szCs w:val="20"/>
+              </w:rPr>
+              <w:t xml:space="preserve">Đuôi AT trong mã: các mã dành cho ô tô của onsemi thường kết thúc bằng AT (AR0233AT, AR0234AT); bản không phải xe hơi của cùng con chip dùng đuôi khác (ví dụ AR0234CS). Thấy AT thì biết nó nhắm vào ô tô.</w:t>
+            </w:r>
+          </w:p>
+          <w:p>
+            <w:pPr>
+              <w:spacing w:after="0" w:line="310"/>
+            </w:pPr>
+            <w:r>
+              <w:rPr>
+                <w:rFonts w:ascii="Arial" w:cs="Arial" w:eastAsia="Arial" w:hAnsi="Arial"/>
+                <w:color w:val="1B1B1B"/>
+                <w:sz w:val="20"/>
+                <w:szCs w:val="20"/>
+              </w:rPr>
+              <w:t xml:space="preserve">Câu quan trọng nhất: onsemi bán «con chip», không bán «camera». Thứ họ giao là một con chip cảm quang vuông vức, ống kính bạn tự lắp — đó chính là đáp án của câu hỏi bên dưới.</w:t>
+            </w:r>
+          </w:p>
+        </w:tc>
+      </w:tr>
+    </w:tbl>
     <w:p>
       <w:pPr>
         <w:widowControl/>

</xml_diff>

<commit_message>
術語表補上 Laser Wavelength 與 Beam Diameter Exiting Sensor
附錄二的三語術語表裡有 Class 1 eye-safe 和 Beam Divergence，可是
LASER 那一格的另外兩行沒有。第 2 節第 10 張現在四行都標了中越譯名，
術語表要對得起來。

補的兩行插在 Class 1 和 Beam Divergence 中間，所以 LASER 那一格的
四個詞在術語表上連成一組，順序和規格表一樣：

  Class 1 eye-safe             Class 1 對眼睛安全    Class 1 an toàn mắt
  Laser Wavelength             雷射波長              Bước sóng laser
  Beam Diameter Exiting Sensor 出口光束直徑          Đường kính chùm tia ra
  Beam Divergence              光束發散角            Góc phân kỳ chùm tia

驗過：中文 34 頁、越文 30 頁，兩版六個字串都比對過；中文版術語表
那一頁（第 32 頁）render 出來看過。

Co-Authored-By: Claude Opus 5 (1M context) <noreply@anthropic.com>
</commit_message>
<xml_diff>
--- a/第五週(10-08)/Nguyên lý xe tự lái_Tuần 5_Tài liệu học tập.docx
+++ b/第五週(10-08)/Nguyên lý xe tự lái_Tuần 5_Tài liệu học tập.docx
@@ -10374,6 +10374,186 @@
                 <w:szCs w:val="18"/>
               </w:rPr>
               <w:t xml:space="preserve">Class 1 an toàn mắt</w:t>
+            </w:r>
+          </w:p>
+        </w:tc>
+      </w:tr>
+      <w:tr>
+        <w:trPr>
+          <w:cantSplit/>
+          <w:tblHeader w:val="false"/>
+        </w:trPr>
+        <w:tc>
+          <w:tcPr>
+            <w:tcW w:type="dxa" w:w="3200"/>
+            <w:tcMar>
+              <w:top w:type="dxa" w:w="60"/>
+              <w:left w:type="dxa" w:w="95"/>
+              <w:bottom w:type="dxa" w:w="60"/>
+              <w:right w:type="dxa" w:w="95"/>
+            </w:tcMar>
+            <w:vAlign w:val="center"/>
+          </w:tcPr>
+          <w:p>
+            <w:pPr>
+              <w:spacing w:after="0" w:line="265"/>
+            </w:pPr>
+            <w:r>
+              <w:rPr>
+                <w:rFonts w:ascii="Arial" w:cs="Arial" w:eastAsia="Arial" w:hAnsi="Arial"/>
+                <w:b w:val="false"/>
+                <w:bCs w:val="false"/>
+                <w:color w:val="1B1B1B"/>
+                <w:sz w:val="18"/>
+                <w:szCs w:val="18"/>
+              </w:rPr>
+              <w:t xml:space="preserve">Laser Wavelength</w:t>
+            </w:r>
+          </w:p>
+        </w:tc>
+        <w:tc>
+          <w:tcPr>
+            <w:tcW w:type="dxa" w:w="3080"/>
+            <w:tcMar>
+              <w:top w:type="dxa" w:w="60"/>
+              <w:left w:type="dxa" w:w="95"/>
+              <w:bottom w:type="dxa" w:w="60"/>
+              <w:right w:type="dxa" w:w="95"/>
+            </w:tcMar>
+            <w:vAlign w:val="center"/>
+          </w:tcPr>
+          <w:p>
+            <w:pPr>
+              <w:spacing w:after="0" w:line="265"/>
+            </w:pPr>
+            <w:r>
+              <w:rPr>
+                <w:rFonts w:ascii="Arial" w:cs="Arial" w:eastAsia="Arial" w:hAnsi="Arial"/>
+                <w:b w:val="false"/>
+                <w:bCs w:val="false"/>
+                <w:color w:val="1B1B1B"/>
+                <w:sz w:val="18"/>
+                <w:szCs w:val="18"/>
+              </w:rPr>
+              <w:t xml:space="preserve">雷射波長</w:t>
+            </w:r>
+          </w:p>
+        </w:tc>
+        <w:tc>
+          <w:tcPr>
+            <w:tcW w:type="dxa" w:w="3080"/>
+            <w:tcMar>
+              <w:top w:type="dxa" w:w="60"/>
+              <w:left w:type="dxa" w:w="95"/>
+              <w:bottom w:type="dxa" w:w="60"/>
+              <w:right w:type="dxa" w:w="95"/>
+            </w:tcMar>
+            <w:vAlign w:val="center"/>
+          </w:tcPr>
+          <w:p>
+            <w:pPr>
+              <w:spacing w:after="0" w:line="265"/>
+            </w:pPr>
+            <w:r>
+              <w:rPr>
+                <w:rFonts w:ascii="Arial" w:cs="Arial" w:eastAsia="Arial" w:hAnsi="Arial"/>
+                <w:b w:val="false"/>
+                <w:bCs w:val="false"/>
+                <w:color w:val="1B1B1B"/>
+                <w:sz w:val="18"/>
+                <w:szCs w:val="18"/>
+              </w:rPr>
+              <w:t xml:space="preserve">Bước sóng laser</w:t>
+            </w:r>
+          </w:p>
+        </w:tc>
+      </w:tr>
+      <w:tr>
+        <w:trPr>
+          <w:cantSplit/>
+          <w:tblHeader w:val="false"/>
+        </w:trPr>
+        <w:tc>
+          <w:tcPr>
+            <w:tcW w:type="dxa" w:w="3200"/>
+            <w:tcMar>
+              <w:top w:type="dxa" w:w="60"/>
+              <w:left w:type="dxa" w:w="95"/>
+              <w:bottom w:type="dxa" w:w="60"/>
+              <w:right w:type="dxa" w:w="95"/>
+            </w:tcMar>
+            <w:vAlign w:val="center"/>
+          </w:tcPr>
+          <w:p>
+            <w:pPr>
+              <w:spacing w:after="0" w:line="265"/>
+            </w:pPr>
+            <w:r>
+              <w:rPr>
+                <w:rFonts w:ascii="Arial" w:cs="Arial" w:eastAsia="Arial" w:hAnsi="Arial"/>
+                <w:b w:val="false"/>
+                <w:bCs w:val="false"/>
+                <w:color w:val="1B1B1B"/>
+                <w:sz w:val="18"/>
+                <w:szCs w:val="18"/>
+              </w:rPr>
+              <w:t xml:space="preserve">Beam Diameter Exiting Sensor</w:t>
+            </w:r>
+          </w:p>
+        </w:tc>
+        <w:tc>
+          <w:tcPr>
+            <w:tcW w:type="dxa" w:w="3080"/>
+            <w:tcMar>
+              <w:top w:type="dxa" w:w="60"/>
+              <w:left w:type="dxa" w:w="95"/>
+              <w:bottom w:type="dxa" w:w="60"/>
+              <w:right w:type="dxa" w:w="95"/>
+            </w:tcMar>
+            <w:vAlign w:val="center"/>
+          </w:tcPr>
+          <w:p>
+            <w:pPr>
+              <w:spacing w:after="0" w:line="265"/>
+            </w:pPr>
+            <w:r>
+              <w:rPr>
+                <w:rFonts w:ascii="Arial" w:cs="Arial" w:eastAsia="Arial" w:hAnsi="Arial"/>
+                <w:b w:val="false"/>
+                <w:bCs w:val="false"/>
+                <w:color w:val="1B1B1B"/>
+                <w:sz w:val="18"/>
+                <w:szCs w:val="18"/>
+              </w:rPr>
+              <w:t xml:space="preserve">出口光束直徑</w:t>
+            </w:r>
+          </w:p>
+        </w:tc>
+        <w:tc>
+          <w:tcPr>
+            <w:tcW w:type="dxa" w:w="3080"/>
+            <w:tcMar>
+              <w:top w:type="dxa" w:w="60"/>
+              <w:left w:type="dxa" w:w="95"/>
+              <w:bottom w:type="dxa" w:w="60"/>
+              <w:right w:type="dxa" w:w="95"/>
+            </w:tcMar>
+            <w:vAlign w:val="center"/>
+          </w:tcPr>
+          <w:p>
+            <w:pPr>
+              <w:spacing w:after="0" w:line="265"/>
+            </w:pPr>
+            <w:r>
+              <w:rPr>
+                <w:rFonts w:ascii="Arial" w:cs="Arial" w:eastAsia="Arial" w:hAnsi="Arial"/>
+                <w:b w:val="false"/>
+                <w:bCs w:val="false"/>
+                <w:color w:val="1B1B1B"/>
+                <w:sz w:val="18"/>
+                <w:szCs w:val="18"/>
+              </w:rPr>
+              <w:t xml:space="preserve">Đường kính chùm tia ra</w:t>
             </w:r>
           </w:p>
         </w:tc>

</xml_diff>